<commit_message>
Put the 2025 IQCB summary in the chronology and the downloads in the source table.
</commit_message>
<xml_diff>
--- a/public/docs/History_of_Neurofeedback_Practice_Standards.docx
+++ b/public/docs/History_of_Neurofeedback_Practice_Standards.docx
@@ -377,7 +377,7 @@
           <w:sz w:val="22"/>
           <w:szCs w:val="22"/>
         </w:rPr>
-        <w:t xml:space="preserve">The International QEEG Certification Board certifies at diplomate and technologist levels and in 2025 published technical and report-writing guidance. CRED-nf (2020) is a consensus checklist for the design and reporting of neurofeedback experiments. It belongs with research practice, not with clinical Standards of Care.</w:t>
+        <w:t xml:space="preserve">The International QEEG Certification Board certifies at diplomate and technologist levels. In 2025 it supported two further instruments. Collura and colleagues published minimum technical requirements for clinical quantitative EEG in Clinical EEG and Neuroscience (received 7 June 2023, accepted 3 December 2024): a 19-site recording, eyes-open and eyes-closed samples, visual inspection of the whole raw tracing, and a check of automated artifacting or computer-generated maps against that tracing. An IQCB committee, dated 16 March 2025, recommended a seven-part report, a disclaimer that the report does not diagnose, and a signature by a qualified clinician. Software and artificial intelligence may help gather or summarize. They are not the interpretation. These are quantitative-EEG guidelines, not a field-wide Standard of Care for neurofeedback. CRED-nf (2020) is a consensus checklist for the design and reporting of neurofeedback experiments. It belongs with research practice, not with clinical Standards of Care.</w:t>
       </w:r>
     </w:p>
     <w:p>
@@ -397,7 +397,7 @@
           <w:sz w:val="30"/>
           <w:szCs w:val="30"/>
         </w:rPr>
-        <w:t xml:space="preserve">Source table</w:t>
+        <w:t xml:space="preserve">Source documents</w:t>
       </w:r>
     </w:p>
     <w:p>
@@ -3440,7 +3440,7 @@
                 <w:sz w:val="16"/>
                 <w:szCs w:val="16"/>
               </w:rPr>
-              <w:t xml:space="preserve">Acquisition, visual inspection of the raw EEG, artifact handling, data selection, and quantitative processing minima. Extends clinical EEG technical standards into quantitative work.</w:t>
+              <w:t xml:space="preserve">IQCB-supported minimum for clinical QEEG. A 19-site 10-20 recording, about ten minutes eyes open and ten minutes eyes closed, then visual inspection of the whole raw tracing. Quantification uses about two to five minutes of artifact-free data in each condition. Automated artifact rejection, source imaging, and discriminant functions may assist. They do not replace inspection of the original traces. Intended for practicum submissions, intakes, baselines, and comparative use.</w:t>
             </w:r>
           </w:p>
         </w:tc>
@@ -3618,7 +3618,7 @@
                 <w:sz w:val="16"/>
                 <w:szCs w:val="16"/>
               </w:rPr>
-              <w:t xml:space="preserve">Recommended sections of a quantitative EEG report. Computer-generated text may assist organization; it does not replace clinician review of raw traces and clinical correlation.</w:t>
+              <w:t xml:space="preserve">IQCB committee guidance of 16 March 2025. Seven sections: clinician identity, client information, technical methods, surface EEG observations, quantitative findings, summary and recommendations within scope, and appendices. The report carries a disclaimer that it does not diagnose. A qualified clinician (QEEG-D or QEEG-DL) reviews and signs it. AI may help gather or summarize. It is not the interpretation, and it does not replace artifact review or clinical correlation.</w:t>
             </w:r>
           </w:p>
         </w:tc>

</xml_diff>